<commit_message>
Tribune Dutreil v5 : corrections de rigueur sur le rapport de la Cour
Dépense fiscale au lieu de coût réel (5,5 Md€), avantage moyen rapporté aux
1 % de bénéficiaires, contours encore discutés de la holding animatrice au
lieu d'une absence de définition (LF 2024 ayant codifié l'éligibilité).

Co-Authored-By: Claude Fable 5 <noreply@anthropic.com>
Claude-Session: https://claude.ai/code/session_01EismpbntstLAG4woJnWJbX
</commit_message>
<xml_diff>
--- a/livrables/Tribune-Dutreil-Carrez/Tribune-Dutreil_Version-La-Tribune_4000-signes.docx
+++ b/livrables/Tribune-Dutreil-Carrez/Tribune-Dutreil_Version-La-Tribune_4000-signes.docx
@@ -18,7 +18,7 @@
           <w:sz w:val="18"/>
           <w:szCs w:val="18"/>
         </w:rPr>
-        <w:t xml:space="preserve">Projet de tribune, cosignature Gilles Carrez / François Ouairy. Format court ~4 000 signes, proposé à La Tribune (rubrique Opinions), utilisable tel quel pour toute rédaction. Les passages entre crochets sont à la main de M. Carrez. Version 4 du 3 septembre 2026.</w:t>
+        <w:t xml:space="preserve">Projet de tribune, cosignature Gilles Carrez / François Ouairy. Format court ~4 000 signes, proposé à La Tribune (rubrique Opinions), utilisable tel quel pour toute rédaction. Les passages entre crochets sont à la main de M. Carrez. Version 5 du 3 septembre 2026.</w:t>
       </w:r>
     </w:p>
     <w:p>
@@ -56,26 +56,26 @@
           <w:sz w:val="24"/>
           <w:szCs w:val="24"/>
         </w:rPr>
-        <w:t xml:space="preserve">Le 30 septembre, le projet de loi de finances pour 2027 arrive en Conseil des ministres. Comme chaque automne depuis vingt ans, le pacte Dutreil, cette exonération de 75 % des droits qui permet de transmettre une entreprise familiale sans la vendre pour payer l'impôt, servira de cible. Cette année, les artilleurs disposent d'une munition neuve. La Cour des comptes évalue désormais le coût réel du dispositif à 5,5 milliards d'euros pour 2024, très loin des 800 millions affichés dans les documents budgétaires, et concentré sur une poignée de très grandes transmissions. Le plafonnement de l'avantage figure déjà dans les amendements qui circulent.</w:t>
-      </w:r>
-    </w:p>
-    <w:p>
-      <w:pPr>
-        <w:spacing w:after="200" w:before="0" w:line="360"/>
-        <w:jc w:val="both"/>
-      </w:pPr>
-      <w:r>
-        <w:rPr>
-          <w:rFonts w:ascii="Times New Roman" w:cs="Times New Roman" w:eastAsia="Times New Roman" w:hAnsi="Times New Roman"/>
-          <w:b w:val="false"/>
-          <w:bCs w:val="false"/>
-          <w:i w:val="false"/>
-          <w:iCs w:val="false"/>
-          <w:color w:val="000000"/>
-          <w:sz w:val="24"/>
-          <w:szCs w:val="24"/>
-        </w:rPr>
-        <w:t xml:space="preserve">Ces chiffres méritent mieux qu'un haussement d'épaules. [L'un de nous fut co-rapporteur de la loi de 2003 qui a créé ce dispositif ; l'autre le met en œuvre chaque semaine, pour des entreprises de toutes tailles.] Ce que la Cour documente est exact. La dépense a plus que quadruplé en quatre ans. Des montages logent dans l'exonération de la trésorerie ou de l'immobilier qui n'ont rien à voir avec l'activité. L'avantage moyen des foyers les mieux servis approche trente millions d'euros. Ces montages doivent sortir du régime. Il y survivra très bien.</w:t>
+        <w:t xml:space="preserve">Le 30 septembre, le projet de loi de finances pour 2027 arrive en Conseil des ministres. Comme chaque automne depuis vingt ans, le pacte Dutreil, cette exonération de 75 % des droits qui permet de transmettre une entreprise familiale sans la vendre pour payer l'impôt, servira de cible. Cette année, les artilleurs disposent d'une munition neuve. La Cour des comptes évalue désormais la dépense fiscale à 5,5 milliards d'euros pour 2024, très au-dessus des 800 millions retenus jusque-là dans les documents budgétaires, et concentrée sur une poignée de très grandes transmissions. Le plafonnement de l'avantage figure déjà dans les amendements qui circulent.</w:t>
+      </w:r>
+    </w:p>
+    <w:p>
+      <w:pPr>
+        <w:spacing w:after="200" w:before="0" w:line="360"/>
+        <w:jc w:val="both"/>
+      </w:pPr>
+      <w:r>
+        <w:rPr>
+          <w:rFonts w:ascii="Times New Roman" w:cs="Times New Roman" w:eastAsia="Times New Roman" w:hAnsi="Times New Roman"/>
+          <w:b w:val="false"/>
+          <w:bCs w:val="false"/>
+          <w:i w:val="false"/>
+          <w:iCs w:val="false"/>
+          <w:color w:val="000000"/>
+          <w:sz w:val="24"/>
+          <w:szCs w:val="24"/>
+        </w:rPr>
+        <w:t xml:space="preserve">Ces chiffres méritent mieux qu'un haussement d'épaules. [L'un de nous fut co-rapporteur de la loi de 2003 qui a créé ce dispositif ; l'autre le met en œuvre chaque semaine, pour des entreprises de toutes tailles.] Ce que la Cour documente est exact. La dépense a plus que quadruplé en quatre ans. Des montages logent dans l'exonération de la trésorerie ou de l'immobilier qui n'ont rien à voir avec l'activité. L'avantage moyen des 1 % de bénéficiaires les mieux servis approche trente millions d'euros. Ces montages doivent sortir du régime. Il y survivra très bien.</w:t>
       </w:r>
     </w:p>
     <w:p>
@@ -132,7 +132,7 @@
           <w:sz w:val="24"/>
           <w:szCs w:val="24"/>
         </w:rPr>
-        <w:t xml:space="preserve">Le vrai problème est plus bête. Les règles ne tiennent pas en place. Un pacte signé aujourd'hui court jusqu'en 2034 ; d'ici là, huit lois de finances, des doctrines administratives qui bougent, une jurisprudence qui n'a toujours pas fixé ce qu'est une holding animatrice, cette société de tête dont dépend l'accès au régime pour des milliers de groupes familiaux. Chaque automne, un plafond circule, un amendement surgit, une suppression se vote en commission avant de disparaître en séance. Les familles, elles, restent engagées.</w:t>
+        <w:t xml:space="preserve">Le vrai problème est plus bête. Les règles ne tiennent pas en place. Un pacte signé aujourd'hui court jusqu'en 2034 ; d'ici là, huit lois de finances, des doctrines administratives qui bougent, les contours encore discutés de la holding animatrice, cette société de tête dont dépend l'accès au régime pour des milliers de groupes familiaux. Chaque automne, un plafond circule, un amendement surgit, une suppression se vote en commission avant de disparaître en séance. Les familles, elles, restent engagées.</w:t>
       </w:r>
     </w:p>
     <w:p>

</xml_diff>